<commit_message>
Actualizar informe con comandos de GitHub
</commit_message>
<xml_diff>
--- a/Informe_Actividad_1.docx
+++ b/Informe_Actividad_1.docx
@@ -6072,6 +6072,460 @@
           <w:rFonts w:ascii="Times New Roman" w:hAnsi="Times New Roman" w:cs="Times New Roman"/>
         </w:rPr>
       </w:pPr>
+      <w:r>
+        <w:rPr>
+          <w:rFonts w:ascii="Times New Roman" w:hAnsi="Times New Roman" w:cs="Times New Roman"/>
+          <w:b/>
+          <w:bCs/>
+        </w:rPr>
+        <w:t>Comandos utilizados para subir el informe a GitHub</w:t>
+      </w:r>
+    </w:p>
+    <w:p>
+      <w:pPr>
+        <w:spacing w:line="360" w:lineRule="auto"/>
+        <w:jc w:val="both"/>
+        <w:rPr>
+          <w:rFonts w:ascii="Times New Roman" w:hAnsi="Times New Roman" w:cs="Times New Roman"/>
+        </w:rPr>
+      </w:pPr>
+      <w:r>
+        <w:rPr>
+          <w:rFonts w:ascii="Times New Roman" w:hAnsi="Times New Roman" w:cs="Times New Roman"/>
+        </w:rPr>
+        <w:t>Para agregar el informe al repositorio y subirlo a GitHub se utilizaron los siguientes comandos:</w:t>
+      </w:r>
+    </w:p>
+    <w:p>
+      <w:pPr>
+        <w:spacing w:line="360" w:lineRule="auto"/>
+        <w:jc w:val="both"/>
+        <w:rPr>
+          <w:rFonts w:ascii="Times New Roman" w:hAnsi="Times New Roman" w:cs="Times New Roman"/>
+        </w:rPr>
+      </w:pPr>
+      <w:proofErr w:type="spellStart"/>
+      <w:r>
+        <w:rPr>
+          <w:rFonts w:ascii="Times New Roman" w:hAnsi="Times New Roman" w:cs="Times New Roman"/>
+        </w:rPr>
+        <w:t>git</w:t>
+      </w:r>
+      <w:proofErr w:type="spellEnd"/>
+      <w:r>
+        <w:rPr>
+          <w:rFonts w:ascii="Times New Roman" w:hAnsi="Times New Roman" w:cs="Times New Roman"/>
+        </w:rPr>
+        <w:t xml:space="preserve"> </w:t>
+      </w:r>
+      <w:proofErr w:type="spellStart"/>
+      <w:r>
+        <w:rPr>
+          <w:rFonts w:ascii="Times New Roman" w:hAnsi="Times New Roman" w:cs="Times New Roman"/>
+        </w:rPr>
+        <w:t>add</w:t>
+      </w:r>
+      <w:proofErr w:type="spellEnd"/>
+      <w:r>
+        <w:rPr>
+          <w:rFonts w:ascii="Times New Roman" w:hAnsi="Times New Roman" w:cs="Times New Roman"/>
+        </w:rPr>
+        <w:t xml:space="preserve"> Informe_Actividad_1.docx</w:t>
+      </w:r>
+    </w:p>
+    <w:p>
+      <w:pPr>
+        <w:spacing w:line="360" w:lineRule="auto"/>
+        <w:jc w:val="both"/>
+        <w:rPr>
+          <w:rFonts w:ascii="Times New Roman" w:hAnsi="Times New Roman" w:cs="Times New Roman"/>
+        </w:rPr>
+      </w:pPr>
+      <w:proofErr w:type="spellStart"/>
+      <w:r>
+        <w:rPr>
+          <w:rFonts w:ascii="Times New Roman" w:hAnsi="Times New Roman" w:cs="Times New Roman"/>
+        </w:rPr>
+        <w:t>git</w:t>
+      </w:r>
+      <w:proofErr w:type="spellEnd"/>
+      <w:r>
+        <w:rPr>
+          <w:rFonts w:ascii="Times New Roman" w:hAnsi="Times New Roman" w:cs="Times New Roman"/>
+        </w:rPr>
+        <w:t xml:space="preserve"> </w:t>
+      </w:r>
+      <w:proofErr w:type="gramStart"/>
+      <w:r>
+        <w:rPr>
+          <w:rFonts w:ascii="Times New Roman" w:hAnsi="Times New Roman" w:cs="Times New Roman"/>
+        </w:rPr>
+        <w:t>status</w:t>
+      </w:r>
+      <w:proofErr w:type="gramEnd"/>
+    </w:p>
+    <w:p>
+      <w:pPr>
+        <w:spacing w:line="360" w:lineRule="auto"/>
+        <w:jc w:val="both"/>
+        <w:rPr>
+          <w:rFonts w:ascii="Times New Roman" w:hAnsi="Times New Roman" w:cs="Times New Roman"/>
+        </w:rPr>
+      </w:pPr>
+      <w:proofErr w:type="spellStart"/>
+      <w:r>
+        <w:rPr>
+          <w:rFonts w:ascii="Times New Roman" w:hAnsi="Times New Roman" w:cs="Times New Roman"/>
+        </w:rPr>
+        <w:lastRenderedPageBreak/>
+        <w:t>git</w:t>
+      </w:r>
+      <w:proofErr w:type="spellEnd"/>
+      <w:r>
+        <w:rPr>
+          <w:rFonts w:ascii="Times New Roman" w:hAnsi="Times New Roman" w:cs="Times New Roman"/>
+        </w:rPr>
+        <w:t xml:space="preserve"> </w:t>
+      </w:r>
+      <w:proofErr w:type="spellStart"/>
+      <w:r>
+        <w:rPr>
+          <w:rFonts w:ascii="Times New Roman" w:hAnsi="Times New Roman" w:cs="Times New Roman"/>
+        </w:rPr>
+        <w:t>commit</w:t>
+      </w:r>
+      <w:proofErr w:type="spellEnd"/>
+      <w:r>
+        <w:rPr>
+          <w:rFonts w:ascii="Times New Roman" w:hAnsi="Times New Roman" w:cs="Times New Roman"/>
+        </w:rPr>
+        <w:t xml:space="preserve"> -m "Agregar informe de actividad 1"</w:t>
+      </w:r>
+    </w:p>
+    <w:p>
+      <w:pPr>
+        <w:spacing w:line="360" w:lineRule="auto"/>
+        <w:jc w:val="both"/>
+        <w:rPr>
+          <w:rFonts w:ascii="Times New Roman" w:hAnsi="Times New Roman" w:cs="Times New Roman"/>
+        </w:rPr>
+      </w:pPr>
+      <w:proofErr w:type="spellStart"/>
+      <w:r>
+        <w:rPr>
+          <w:rFonts w:ascii="Times New Roman" w:hAnsi="Times New Roman" w:cs="Times New Roman"/>
+        </w:rPr>
+        <w:t>git</w:t>
+      </w:r>
+      <w:proofErr w:type="spellEnd"/>
+      <w:r>
+        <w:rPr>
+          <w:rFonts w:ascii="Times New Roman" w:hAnsi="Times New Roman" w:cs="Times New Roman"/>
+        </w:rPr>
+        <w:t xml:space="preserve"> </w:t>
+      </w:r>
+      <w:proofErr w:type="spellStart"/>
+      <w:r>
+        <w:rPr>
+          <w:rFonts w:ascii="Times New Roman" w:hAnsi="Times New Roman" w:cs="Times New Roman"/>
+        </w:rPr>
+        <w:t>push</w:t>
+      </w:r>
+      <w:proofErr w:type="spellEnd"/>
+      <w:r>
+        <w:rPr>
+          <w:rFonts w:ascii="Times New Roman" w:hAnsi="Times New Roman" w:cs="Times New Roman"/>
+        </w:rPr>
+        <w:t xml:space="preserve"> </w:t>
+      </w:r>
+      <w:proofErr w:type="spellStart"/>
+      <w:r>
+        <w:rPr>
+          <w:rFonts w:ascii="Times New Roman" w:hAnsi="Times New Roman" w:cs="Times New Roman"/>
+        </w:rPr>
+        <w:t>origin</w:t>
+      </w:r>
+      <w:proofErr w:type="spellEnd"/>
+      <w:r>
+        <w:rPr>
+          <w:rFonts w:ascii="Times New Roman" w:hAnsi="Times New Roman" w:cs="Times New Roman"/>
+        </w:rPr>
+        <w:t xml:space="preserve"> </w:t>
+      </w:r>
+      <w:proofErr w:type="spellStart"/>
+      <w:r>
+        <w:rPr>
+          <w:rFonts w:ascii="Times New Roman" w:hAnsi="Times New Roman" w:cs="Times New Roman"/>
+        </w:rPr>
+        <w:t>feature</w:t>
+      </w:r>
+      <w:proofErr w:type="spellEnd"/>
+      <w:r>
+        <w:rPr>
+          <w:rFonts w:ascii="Times New Roman" w:hAnsi="Times New Roman" w:cs="Times New Roman"/>
+        </w:rPr>
+        <w:t>/cambio-prueba</w:t>
+      </w:r>
+    </w:p>
+    <w:p>
+      <w:pPr>
+        <w:spacing w:line="360" w:lineRule="auto"/>
+        <w:jc w:val="both"/>
+        <w:rPr>
+          <w:rFonts w:ascii="Times New Roman" w:hAnsi="Times New Roman" w:cs="Times New Roman"/>
+        </w:rPr>
+      </w:pPr>
+      <w:r>
+        <w:rPr>
+          <w:rFonts w:ascii="Times New Roman" w:hAnsi="Times New Roman" w:cs="Times New Roman"/>
+          <w:b/>
+          <w:bCs/>
+        </w:rPr>
+        <w:t>Función de cada comando:</w:t>
+      </w:r>
+    </w:p>
+    <w:p>
+      <w:pPr>
+        <w:numPr>
+          <w:ilvl w:val="0"/>
+          <w:numId w:val="2"/>
+        </w:numPr>
+        <w:spacing w:line="360" w:lineRule="auto"/>
+        <w:jc w:val="both"/>
+        <w:rPr>
+          <w:rFonts w:ascii="Times New Roman" w:hAnsi="Times New Roman" w:cs="Times New Roman"/>
+        </w:rPr>
+      </w:pPr>
+      <w:proofErr w:type="spellStart"/>
+      <w:r>
+        <w:rPr>
+          <w:rFonts w:ascii="Times New Roman" w:hAnsi="Times New Roman" w:cs="Times New Roman"/>
+        </w:rPr>
+        <w:t>git</w:t>
+      </w:r>
+      <w:proofErr w:type="spellEnd"/>
+      <w:r>
+        <w:rPr>
+          <w:rFonts w:ascii="Times New Roman" w:hAnsi="Times New Roman" w:cs="Times New Roman"/>
+        </w:rPr>
+        <w:t xml:space="preserve"> </w:t>
+      </w:r>
+      <w:proofErr w:type="spellStart"/>
+      <w:r>
+        <w:rPr>
+          <w:rFonts w:ascii="Times New Roman" w:hAnsi="Times New Roman" w:cs="Times New Roman"/>
+        </w:rPr>
+        <w:t>add</w:t>
+      </w:r>
+      <w:proofErr w:type="spellEnd"/>
+      <w:r>
+        <w:rPr>
+          <w:rFonts w:ascii="Times New Roman" w:hAnsi="Times New Roman" w:cs="Times New Roman"/>
+        </w:rPr>
+        <w:t xml:space="preserve"> Informe_Actividad_1.docx → agrega el archivo del informe al </w:t>
+      </w:r>
+      <w:proofErr w:type="spellStart"/>
+      <w:r>
+        <w:rPr>
+          <w:rFonts w:ascii="Times New Roman" w:hAnsi="Times New Roman" w:cs="Times New Roman"/>
+        </w:rPr>
+        <w:t>staging</w:t>
+      </w:r>
+      <w:proofErr w:type="spellEnd"/>
+      <w:r>
+        <w:rPr>
+          <w:rFonts w:ascii="Times New Roman" w:hAnsi="Times New Roman" w:cs="Times New Roman"/>
+        </w:rPr>
+        <w:t xml:space="preserve"> de Git.</w:t>
+      </w:r>
+    </w:p>
+    <w:p>
+      <w:pPr>
+        <w:numPr>
+          <w:ilvl w:val="0"/>
+          <w:numId w:val="2"/>
+        </w:numPr>
+        <w:spacing w:line="360" w:lineRule="auto"/>
+        <w:jc w:val="both"/>
+        <w:rPr>
+          <w:rFonts w:ascii="Times New Roman" w:hAnsi="Times New Roman" w:cs="Times New Roman"/>
+        </w:rPr>
+      </w:pPr>
+      <w:proofErr w:type="spellStart"/>
+      <w:r>
+        <w:rPr>
+          <w:rFonts w:ascii="Times New Roman" w:hAnsi="Times New Roman" w:cs="Times New Roman"/>
+        </w:rPr>
+        <w:t>git</w:t>
+      </w:r>
+      <w:proofErr w:type="spellEnd"/>
+      <w:r>
+        <w:rPr>
+          <w:rFonts w:ascii="Times New Roman" w:hAnsi="Times New Roman" w:cs="Times New Roman"/>
+        </w:rPr>
+        <w:t xml:space="preserve"> </w:t>
+      </w:r>
+      <w:proofErr w:type="gramStart"/>
+      <w:r>
+        <w:rPr>
+          <w:rFonts w:ascii="Times New Roman" w:hAnsi="Times New Roman" w:cs="Times New Roman"/>
+        </w:rPr>
+        <w:t>status</w:t>
+      </w:r>
+      <w:proofErr w:type="gramEnd"/>
+      <w:r>
+        <w:rPr>
+          <w:rFonts w:ascii="Times New Roman" w:hAnsi="Times New Roman" w:cs="Times New Roman"/>
+        </w:rPr>
+        <w:t xml:space="preserve"> → permite verificar el estado del archivo antes de realizar el </w:t>
+      </w:r>
+      <w:proofErr w:type="spellStart"/>
+      <w:r>
+        <w:rPr>
+          <w:rFonts w:ascii="Times New Roman" w:hAnsi="Times New Roman" w:cs="Times New Roman"/>
+        </w:rPr>
+        <w:t>commit</w:t>
+      </w:r>
+      <w:proofErr w:type="spellEnd"/>
+      <w:r>
+        <w:rPr>
+          <w:rFonts w:ascii="Times New Roman" w:hAnsi="Times New Roman" w:cs="Times New Roman"/>
+        </w:rPr>
+        <w:t>.</w:t>
+      </w:r>
+    </w:p>
+    <w:p>
+      <w:pPr>
+        <w:numPr>
+          <w:ilvl w:val="0"/>
+          <w:numId w:val="2"/>
+        </w:numPr>
+        <w:spacing w:line="360" w:lineRule="auto"/>
+        <w:jc w:val="both"/>
+        <w:rPr>
+          <w:rFonts w:ascii="Times New Roman" w:hAnsi="Times New Roman" w:cs="Times New Roman"/>
+        </w:rPr>
+      </w:pPr>
+      <w:proofErr w:type="spellStart"/>
+      <w:r>
+        <w:rPr>
+          <w:rFonts w:ascii="Times New Roman" w:hAnsi="Times New Roman" w:cs="Times New Roman"/>
+        </w:rPr>
+        <w:t>git</w:t>
+      </w:r>
+      <w:proofErr w:type="spellEnd"/>
+      <w:r>
+        <w:rPr>
+          <w:rFonts w:ascii="Times New Roman" w:hAnsi="Times New Roman" w:cs="Times New Roman"/>
+        </w:rPr>
+        <w:t xml:space="preserve"> </w:t>
+      </w:r>
+      <w:proofErr w:type="spellStart"/>
+      <w:r>
+        <w:rPr>
+          <w:rFonts w:ascii="Times New Roman" w:hAnsi="Times New Roman" w:cs="Times New Roman"/>
+        </w:rPr>
+        <w:t>commit</w:t>
+      </w:r>
+      <w:proofErr w:type="spellEnd"/>
+      <w:r>
+        <w:rPr>
+          <w:rFonts w:ascii="Times New Roman" w:hAnsi="Times New Roman" w:cs="Times New Roman"/>
+        </w:rPr>
+        <w:t xml:space="preserve"> -m "Agregar informe de actividad 1" → guarda el informe en el historial del repositorio.</w:t>
+      </w:r>
+    </w:p>
+    <w:p>
+      <w:pPr>
+        <w:numPr>
+          <w:ilvl w:val="0"/>
+          <w:numId w:val="2"/>
+        </w:numPr>
+        <w:spacing w:line="360" w:lineRule="auto"/>
+        <w:jc w:val="both"/>
+        <w:rPr>
+          <w:rFonts w:ascii="Times New Roman" w:hAnsi="Times New Roman" w:cs="Times New Roman"/>
+        </w:rPr>
+      </w:pPr>
+      <w:proofErr w:type="spellStart"/>
+      <w:r>
+        <w:rPr>
+          <w:rFonts w:ascii="Times New Roman" w:hAnsi="Times New Roman" w:cs="Times New Roman"/>
+        </w:rPr>
+        <w:t>git</w:t>
+      </w:r>
+      <w:proofErr w:type="spellEnd"/>
+      <w:r>
+        <w:rPr>
+          <w:rFonts w:ascii="Times New Roman" w:hAnsi="Times New Roman" w:cs="Times New Roman"/>
+        </w:rPr>
+        <w:t xml:space="preserve"> </w:t>
+      </w:r>
+      <w:proofErr w:type="spellStart"/>
+      <w:r>
+        <w:rPr>
+          <w:rFonts w:ascii="Times New Roman" w:hAnsi="Times New Roman" w:cs="Times New Roman"/>
+        </w:rPr>
+        <w:t>push</w:t>
+      </w:r>
+      <w:proofErr w:type="spellEnd"/>
+      <w:r>
+        <w:rPr>
+          <w:rFonts w:ascii="Times New Roman" w:hAnsi="Times New Roman" w:cs="Times New Roman"/>
+        </w:rPr>
+        <w:t xml:space="preserve"> </w:t>
+      </w:r>
+      <w:proofErr w:type="spellStart"/>
+      <w:r>
+        <w:rPr>
+          <w:rFonts w:ascii="Times New Roman" w:hAnsi="Times New Roman" w:cs="Times New Roman"/>
+        </w:rPr>
+        <w:t>origin</w:t>
+      </w:r>
+      <w:proofErr w:type="spellEnd"/>
+      <w:r>
+        <w:rPr>
+          <w:rFonts w:ascii="Times New Roman" w:hAnsi="Times New Roman" w:cs="Times New Roman"/>
+        </w:rPr>
+        <w:t xml:space="preserve"> </w:t>
+      </w:r>
+      <w:proofErr w:type="spellStart"/>
+      <w:r>
+        <w:rPr>
+          <w:rFonts w:ascii="Times New Roman" w:hAnsi="Times New Roman" w:cs="Times New Roman"/>
+        </w:rPr>
+        <w:t>feature</w:t>
+      </w:r>
+      <w:proofErr w:type="spellEnd"/>
+      <w:r>
+        <w:rPr>
+          <w:rFonts w:ascii="Times New Roman" w:hAnsi="Times New Roman" w:cs="Times New Roman"/>
+        </w:rPr>
+        <w:t xml:space="preserve">/cambio-prueba → sube el </w:t>
+      </w:r>
+      <w:proofErr w:type="spellStart"/>
+      <w:r>
+        <w:rPr>
+          <w:rFonts w:ascii="Times New Roman" w:hAnsi="Times New Roman" w:cs="Times New Roman"/>
+        </w:rPr>
+        <w:t>commit</w:t>
+      </w:r>
+      <w:proofErr w:type="spellEnd"/>
+      <w:r>
+        <w:rPr>
+          <w:rFonts w:ascii="Times New Roman" w:hAnsi="Times New Roman" w:cs="Times New Roman"/>
+        </w:rPr>
+        <w:t xml:space="preserve"> y el informe al repositorio remoto de GitHub.</w:t>
+      </w:r>
+    </w:p>
+    <w:p>
+      <w:pPr>
+        <w:spacing w:line="360" w:lineRule="auto"/>
+        <w:jc w:val="both"/>
+        <w:rPr>
+          <w:rFonts w:ascii="Times New Roman" w:hAnsi="Times New Roman" w:cs="Times New Roman"/>
+        </w:rPr>
+      </w:pPr>
     </w:p>
     <w:sectPr>
       <w:pgSz w:w="12240" w:h="15840"/>
@@ -6234,8 +6688,160 @@
       </w:rPr>
     </w:lvl>
   </w:abstractNum>
+  <w:abstractNum w:abstractNumId="1" w15:restartNumberingAfterBreak="0">
+    <w:nsid w:val="7ED63EDE"/>
+    <w:multiLevelType w:val="multilevel"/>
+    <w:tmpl w:val="F766BF94"/>
+    <w:lvl w:ilvl="0">
+      <w:start w:val="1"/>
+      <w:numFmt w:val="bullet"/>
+      <w:lvlText w:val=""/>
+      <w:lvlJc w:val="left"/>
+      <w:pPr>
+        <w:tabs>
+          <w:tab w:val="num" w:pos="720"/>
+        </w:tabs>
+        <w:ind w:left="720" w:hanging="360"/>
+      </w:pPr>
+      <w:rPr>
+        <w:rFonts w:ascii="Symbol" w:hAnsi="Symbol" w:hint="default"/>
+        <w:sz w:val="20"/>
+      </w:rPr>
+    </w:lvl>
+    <w:lvl w:ilvl="1" w:tentative="1">
+      <w:start w:val="1"/>
+      <w:numFmt w:val="bullet"/>
+      <w:lvlText w:val="o"/>
+      <w:lvlJc w:val="left"/>
+      <w:pPr>
+        <w:tabs>
+          <w:tab w:val="num" w:pos="1440"/>
+        </w:tabs>
+        <w:ind w:left="1440" w:hanging="360"/>
+      </w:pPr>
+      <w:rPr>
+        <w:rFonts w:ascii="Courier New" w:hAnsi="Courier New" w:hint="default"/>
+        <w:sz w:val="20"/>
+      </w:rPr>
+    </w:lvl>
+    <w:lvl w:ilvl="2" w:tentative="1">
+      <w:start w:val="1"/>
+      <w:numFmt w:val="bullet"/>
+      <w:lvlText w:val=""/>
+      <w:lvlJc w:val="left"/>
+      <w:pPr>
+        <w:tabs>
+          <w:tab w:val="num" w:pos="2160"/>
+        </w:tabs>
+        <w:ind w:left="2160" w:hanging="360"/>
+      </w:pPr>
+      <w:rPr>
+        <w:rFonts w:ascii="Wingdings" w:hAnsi="Wingdings" w:hint="default"/>
+        <w:sz w:val="20"/>
+      </w:rPr>
+    </w:lvl>
+    <w:lvl w:ilvl="3" w:tentative="1">
+      <w:start w:val="1"/>
+      <w:numFmt w:val="bullet"/>
+      <w:lvlText w:val=""/>
+      <w:lvlJc w:val="left"/>
+      <w:pPr>
+        <w:tabs>
+          <w:tab w:val="num" w:pos="2880"/>
+        </w:tabs>
+        <w:ind w:left="2880" w:hanging="360"/>
+      </w:pPr>
+      <w:rPr>
+        <w:rFonts w:ascii="Wingdings" w:hAnsi="Wingdings" w:hint="default"/>
+        <w:sz w:val="20"/>
+      </w:rPr>
+    </w:lvl>
+    <w:lvl w:ilvl="4" w:tentative="1">
+      <w:start w:val="1"/>
+      <w:numFmt w:val="bullet"/>
+      <w:lvlText w:val=""/>
+      <w:lvlJc w:val="left"/>
+      <w:pPr>
+        <w:tabs>
+          <w:tab w:val="num" w:pos="3600"/>
+        </w:tabs>
+        <w:ind w:left="3600" w:hanging="360"/>
+      </w:pPr>
+      <w:rPr>
+        <w:rFonts w:ascii="Wingdings" w:hAnsi="Wingdings" w:hint="default"/>
+        <w:sz w:val="20"/>
+      </w:rPr>
+    </w:lvl>
+    <w:lvl w:ilvl="5" w:tentative="1">
+      <w:start w:val="1"/>
+      <w:numFmt w:val="bullet"/>
+      <w:lvlText w:val=""/>
+      <w:lvlJc w:val="left"/>
+      <w:pPr>
+        <w:tabs>
+          <w:tab w:val="num" w:pos="4320"/>
+        </w:tabs>
+        <w:ind w:left="4320" w:hanging="360"/>
+      </w:pPr>
+      <w:rPr>
+        <w:rFonts w:ascii="Wingdings" w:hAnsi="Wingdings" w:hint="default"/>
+        <w:sz w:val="20"/>
+      </w:rPr>
+    </w:lvl>
+    <w:lvl w:ilvl="6" w:tentative="1">
+      <w:start w:val="1"/>
+      <w:numFmt w:val="bullet"/>
+      <w:lvlText w:val=""/>
+      <w:lvlJc w:val="left"/>
+      <w:pPr>
+        <w:tabs>
+          <w:tab w:val="num" w:pos="5040"/>
+        </w:tabs>
+        <w:ind w:left="5040" w:hanging="360"/>
+      </w:pPr>
+      <w:rPr>
+        <w:rFonts w:ascii="Wingdings" w:hAnsi="Wingdings" w:hint="default"/>
+        <w:sz w:val="20"/>
+      </w:rPr>
+    </w:lvl>
+    <w:lvl w:ilvl="7" w:tentative="1">
+      <w:start w:val="1"/>
+      <w:numFmt w:val="bullet"/>
+      <w:lvlText w:val=""/>
+      <w:lvlJc w:val="left"/>
+      <w:pPr>
+        <w:tabs>
+          <w:tab w:val="num" w:pos="5760"/>
+        </w:tabs>
+        <w:ind w:left="5760" w:hanging="360"/>
+      </w:pPr>
+      <w:rPr>
+        <w:rFonts w:ascii="Wingdings" w:hAnsi="Wingdings" w:hint="default"/>
+        <w:sz w:val="20"/>
+      </w:rPr>
+    </w:lvl>
+    <w:lvl w:ilvl="8" w:tentative="1">
+      <w:start w:val="1"/>
+      <w:numFmt w:val="bullet"/>
+      <w:lvlText w:val=""/>
+      <w:lvlJc w:val="left"/>
+      <w:pPr>
+        <w:tabs>
+          <w:tab w:val="num" w:pos="6480"/>
+        </w:tabs>
+        <w:ind w:left="6480" w:hanging="360"/>
+      </w:pPr>
+      <w:rPr>
+        <w:rFonts w:ascii="Wingdings" w:hAnsi="Wingdings" w:hint="default"/>
+        <w:sz w:val="20"/>
+      </w:rPr>
+    </w:lvl>
+  </w:abstractNum>
   <w:num w:numId="1" w16cid:durableId="288630707">
     <w:abstractNumId w:val="0"/>
+  </w:num>
+  <w:num w:numId="2" w16cid:durableId="39325828">
+    <w:abstractNumId w:val="1"/>
   </w:num>
 </w:numbering>
 </file>

</xml_diff>